<commit_message>
Historias de usuario a completar
</commit_message>
<xml_diff>
--- a/_docs_/trim5/HISTORIAS DE USUARIO - DONACIONES, USUARIOS,REPORTES.docx
+++ b/_docs_/trim5/HISTORIAS DE USUARIO - DONACIONES, USUARIOS,REPORTES.docx
@@ -6683,6 +6683,1533 @@
         </w:rPr>
       </w:pPr>
     </w:p>
+    <w:tbl>
+      <w:tblPr>
+        <w:tblStyle w:val="Tablaconcuadrcula"/>
+        <w:tblW w:w="0" w:type="auto"/>
+        <w:tblLook w:val="04A0" w:firstRow="1" w:lastRow="0" w:firstColumn="1" w:lastColumn="0" w:noHBand="0" w:noVBand="1"/>
+      </w:tblPr>
+      <w:tblGrid>
+        <w:gridCol w:w="1980"/>
+        <w:gridCol w:w="6848"/>
+      </w:tblGrid>
+      <w:tr>
+        <w:tc>
+          <w:tcPr>
+            <w:tcW w:w="1980" w:type="dxa"/>
+            <w:tcBorders>
+              <w:top w:val="nil"/>
+              <w:left w:val="nil"/>
+              <w:bottom w:val="single" w:sz="4" w:space="0" w:color="auto"/>
+              <w:right w:val="single" w:sz="4" w:space="0" w:color="auto"/>
+            </w:tcBorders>
+          </w:tcPr>
+          <w:p>
+            <w:pPr>
+              <w:jc w:val="center"/>
+              <w:rPr>
+                <w:b/>
+                <w:bCs/>
+              </w:rPr>
+            </w:pPr>
+          </w:p>
+        </w:tc>
+        <w:tc>
+          <w:tcPr>
+            <w:tcW w:w="6848" w:type="dxa"/>
+            <w:tcBorders>
+              <w:left w:val="single" w:sz="4" w:space="0" w:color="auto"/>
+            </w:tcBorders>
+          </w:tcPr>
+          <w:p>
+            <w:pPr>
+              <w:jc w:val="center"/>
+              <w:rPr>
+                <w:b/>
+                <w:bCs/>
+              </w:rPr>
+            </w:pPr>
+            <w:r>
+              <w:rPr>
+                <w:b/>
+                <w:bCs/>
+              </w:rPr>
+              <w:t>HU 0</w:t>
+            </w:r>
+            <w:r>
+              <w:rPr>
+                <w:b/>
+                <w:bCs/>
+              </w:rPr>
+              <w:t>1</w:t>
+            </w:r>
+            <w:r>
+              <w:rPr>
+                <w:b/>
+                <w:bCs/>
+              </w:rPr>
+              <w:t>3</w:t>
+            </w:r>
+          </w:p>
+        </w:tc>
+      </w:tr>
+      <w:tr>
+        <w:tc>
+          <w:tcPr>
+            <w:tcW w:w="1980" w:type="dxa"/>
+            <w:tcBorders>
+              <w:top w:val="single" w:sz="4" w:space="0" w:color="auto"/>
+            </w:tcBorders>
+          </w:tcPr>
+          <w:p>
+            <w:pPr>
+              <w:rPr>
+                <w:b/>
+                <w:bCs/>
+              </w:rPr>
+            </w:pPr>
+            <w:r>
+              <w:rPr>
+                <w:b/>
+                <w:bCs/>
+              </w:rPr>
+              <w:t>NOMBRE</w:t>
+            </w:r>
+          </w:p>
+        </w:tc>
+        <w:tc>
+          <w:tcPr>
+            <w:tcW w:w="6848" w:type="dxa"/>
+          </w:tcPr>
+          <w:p>
+            <w:pPr>
+              <w:rPr>
+                <w:b/>
+                <w:bCs/>
+              </w:rPr>
+            </w:pPr>
+            <w:r>
+              <w:rPr>
+                <w:b/>
+                <w:bCs/>
+              </w:rPr>
+              <w:t xml:space="preserve">Crear eventos </w:t>
+            </w:r>
+          </w:p>
+        </w:tc>
+      </w:tr>
+      <w:tr>
+        <w:tc>
+          <w:tcPr>
+            <w:tcW w:w="1980" w:type="dxa"/>
+          </w:tcPr>
+          <w:p>
+            <w:pPr>
+              <w:rPr>
+                <w:b/>
+                <w:bCs/>
+              </w:rPr>
+            </w:pPr>
+            <w:r>
+              <w:rPr>
+                <w:b/>
+                <w:bCs/>
+              </w:rPr>
+              <w:t xml:space="preserve">DESCRPCION </w:t>
+            </w:r>
+          </w:p>
+        </w:tc>
+        <w:tc>
+          <w:tcPr>
+            <w:tcW w:w="6848" w:type="dxa"/>
+          </w:tcPr>
+          <w:p/>
+        </w:tc>
+      </w:tr>
+      <w:tr>
+        <w:tc>
+          <w:tcPr>
+            <w:tcW w:w="1980" w:type="dxa"/>
+          </w:tcPr>
+          <w:p>
+            <w:pPr>
+              <w:rPr>
+                <w:b/>
+                <w:bCs/>
+              </w:rPr>
+            </w:pPr>
+            <w:r>
+              <w:rPr>
+                <w:b/>
+                <w:bCs/>
+              </w:rPr>
+              <w:t>CRITERIOS DE</w:t>
+            </w:r>
+          </w:p>
+          <w:p>
+            <w:pPr>
+              <w:rPr>
+                <w:b/>
+                <w:bCs/>
+              </w:rPr>
+            </w:pPr>
+            <w:r>
+              <w:rPr>
+                <w:b/>
+                <w:bCs/>
+              </w:rPr>
+              <w:t>EVALUACIÓN</w:t>
+            </w:r>
+          </w:p>
+        </w:tc>
+        <w:tc>
+          <w:tcPr>
+            <w:tcW w:w="6848" w:type="dxa"/>
+          </w:tcPr>
+          <w:p>
+            <w:pPr>
+              <w:pStyle w:val="Prrafodelista"/>
+              <w:numPr>
+                <w:ilvl w:val="0"/>
+                <w:numId w:val="26"/>
+              </w:numPr>
+            </w:pPr>
+            <w:r>
+              <w:rPr>
+                <w:rFonts w:ascii="Segoe UI" w:eastAsia="Times New Roman" w:hAnsi="Segoe UI" w:cs="Segoe UI"/>
+                <w:color w:val="0F1115"/>
+                <w:kern w:val="0"/>
+                <w:lang w:eastAsia="es-419"/>
+                <w14:ligatures w14:val="none"/>
+              </w:rPr>
+              <w:t xml:space="preserve">El </w:t>
+            </w:r>
+          </w:p>
+          <w:p>
+            <w:pPr>
+              <w:pStyle w:val="Prrafodelista"/>
+              <w:numPr>
+                <w:ilvl w:val="0"/>
+                <w:numId w:val="26"/>
+              </w:numPr>
+            </w:pPr>
+            <w:r>
+              <w:rPr>
+                <w:rFonts w:ascii="Segoe UI" w:eastAsia="Times New Roman" w:hAnsi="Segoe UI" w:cs="Segoe UI"/>
+                <w:color w:val="0F1115"/>
+                <w:kern w:val="0"/>
+                <w:lang w:eastAsia="es-419"/>
+                <w14:ligatures w14:val="none"/>
+              </w:rPr>
+              <w:t>El</w:t>
+            </w:r>
+            <w:r>
+              <w:rPr>
+                <w:rFonts w:ascii="Segoe UI" w:eastAsia="Times New Roman" w:hAnsi="Segoe UI" w:cs="Segoe UI"/>
+                <w:color w:val="0F1115"/>
+                <w:kern w:val="0"/>
+                <w:lang w:eastAsia="es-419"/>
+                <w14:ligatures w14:val="none"/>
+              </w:rPr>
+              <w:t>.</w:t>
+            </w:r>
+          </w:p>
+          <w:p>
+            <w:pPr>
+              <w:pStyle w:val="Prrafodelista"/>
+              <w:numPr>
+                <w:ilvl w:val="0"/>
+                <w:numId w:val="26"/>
+              </w:numPr>
+            </w:pPr>
+            <w:r>
+              <w:rPr>
+                <w:rFonts w:ascii="Segoe UI" w:eastAsia="Times New Roman" w:hAnsi="Segoe UI" w:cs="Segoe UI"/>
+                <w:color w:val="0F1115"/>
+                <w:kern w:val="0"/>
+                <w:lang w:eastAsia="es-419"/>
+                <w14:ligatures w14:val="none"/>
+              </w:rPr>
+              <w:t xml:space="preserve">Solo </w:t>
+            </w:r>
+          </w:p>
+          <w:p>
+            <w:pPr>
+              <w:pStyle w:val="Prrafodelista"/>
+            </w:pPr>
+          </w:p>
+        </w:tc>
+      </w:tr>
+      <w:tr>
+        <w:tc>
+          <w:tcPr>
+            <w:tcW w:w="1980" w:type="dxa"/>
+          </w:tcPr>
+          <w:p>
+            <w:pPr>
+              <w:rPr>
+                <w:b/>
+                <w:bCs/>
+              </w:rPr>
+            </w:pPr>
+            <w:r>
+              <w:rPr>
+                <w:b/>
+                <w:bCs/>
+              </w:rPr>
+              <w:t>PRIORIDAD</w:t>
+            </w:r>
+          </w:p>
+        </w:tc>
+        <w:tc>
+          <w:tcPr>
+            <w:tcW w:w="6848" w:type="dxa"/>
+          </w:tcPr>
+          <w:p>
+            <w:r>
+              <w:t>Alta</w:t>
+            </w:r>
+          </w:p>
+        </w:tc>
+      </w:tr>
+      <w:tr>
+        <w:tc>
+          <w:tcPr>
+            <w:tcW w:w="1980" w:type="dxa"/>
+          </w:tcPr>
+          <w:p>
+            <w:pPr>
+              <w:rPr>
+                <w:b/>
+                <w:bCs/>
+              </w:rPr>
+            </w:pPr>
+            <w:r>
+              <w:rPr>
+                <w:b/>
+                <w:bCs/>
+              </w:rPr>
+              <w:t>RF</w:t>
+            </w:r>
+          </w:p>
+        </w:tc>
+        <w:tc>
+          <w:tcPr>
+            <w:tcW w:w="6848" w:type="dxa"/>
+          </w:tcPr>
+          <w:p>
+            <w:r>
+              <w:t>017</w:t>
+            </w:r>
+          </w:p>
+        </w:tc>
+      </w:tr>
+      <w:tr>
+        <w:tc>
+          <w:tcPr>
+            <w:tcW w:w="1980" w:type="dxa"/>
+          </w:tcPr>
+          <w:p>
+            <w:pPr>
+              <w:rPr>
+                <w:b/>
+                <w:bCs/>
+              </w:rPr>
+            </w:pPr>
+            <w:r>
+              <w:rPr>
+                <w:b/>
+                <w:bCs/>
+              </w:rPr>
+              <w:t>RNF</w:t>
+            </w:r>
+          </w:p>
+        </w:tc>
+        <w:tc>
+          <w:tcPr>
+            <w:tcW w:w="6848" w:type="dxa"/>
+          </w:tcPr>
+          <w:p>
+            <w:r>
+              <w:t>017</w:t>
+            </w:r>
+          </w:p>
+        </w:tc>
+      </w:tr>
+    </w:tbl>
+    <w:p>
+      <w:pPr>
+        <w:rPr>
+          <w:b/>
+          <w:bCs/>
+        </w:rPr>
+      </w:pPr>
+    </w:p>
+    <w:p>
+      <w:pPr>
+        <w:rPr>
+          <w:b/>
+          <w:bCs/>
+        </w:rPr>
+      </w:pPr>
+    </w:p>
+    <w:p>
+      <w:pPr>
+        <w:rPr>
+          <w:b/>
+          <w:bCs/>
+        </w:rPr>
+      </w:pPr>
+    </w:p>
+    <w:p>
+      <w:pPr>
+        <w:rPr>
+          <w:b/>
+          <w:bCs/>
+        </w:rPr>
+      </w:pPr>
+    </w:p>
+    <w:p>
+      <w:pPr>
+        <w:rPr>
+          <w:b/>
+          <w:bCs/>
+        </w:rPr>
+      </w:pPr>
+    </w:p>
+    <w:tbl>
+      <w:tblPr>
+        <w:tblStyle w:val="Tablaconcuadrcula"/>
+        <w:tblW w:w="0" w:type="auto"/>
+        <w:tblLook w:val="04A0" w:firstRow="1" w:lastRow="0" w:firstColumn="1" w:lastColumn="0" w:noHBand="0" w:noVBand="1"/>
+      </w:tblPr>
+      <w:tblGrid>
+        <w:gridCol w:w="1980"/>
+        <w:gridCol w:w="6848"/>
+      </w:tblGrid>
+      <w:tr>
+        <w:tc>
+          <w:tcPr>
+            <w:tcW w:w="1980" w:type="dxa"/>
+            <w:tcBorders>
+              <w:top w:val="nil"/>
+              <w:left w:val="nil"/>
+              <w:bottom w:val="single" w:sz="4" w:space="0" w:color="auto"/>
+              <w:right w:val="single" w:sz="4" w:space="0" w:color="auto"/>
+            </w:tcBorders>
+          </w:tcPr>
+          <w:p>
+            <w:pPr>
+              <w:jc w:val="center"/>
+              <w:rPr>
+                <w:b/>
+                <w:bCs/>
+              </w:rPr>
+            </w:pPr>
+          </w:p>
+        </w:tc>
+        <w:tc>
+          <w:tcPr>
+            <w:tcW w:w="6848" w:type="dxa"/>
+            <w:tcBorders>
+              <w:left w:val="single" w:sz="4" w:space="0" w:color="auto"/>
+            </w:tcBorders>
+          </w:tcPr>
+          <w:p>
+            <w:pPr>
+              <w:jc w:val="center"/>
+              <w:rPr>
+                <w:b/>
+                <w:bCs/>
+              </w:rPr>
+            </w:pPr>
+            <w:r>
+              <w:rPr>
+                <w:b/>
+                <w:bCs/>
+              </w:rPr>
+              <w:t>HU 0</w:t>
+            </w:r>
+            <w:r>
+              <w:rPr>
+                <w:b/>
+                <w:bCs/>
+              </w:rPr>
+              <w:t>1</w:t>
+            </w:r>
+            <w:r>
+              <w:rPr>
+                <w:b/>
+                <w:bCs/>
+              </w:rPr>
+              <w:t>4</w:t>
+            </w:r>
+          </w:p>
+        </w:tc>
+      </w:tr>
+      <w:tr>
+        <w:tc>
+          <w:tcPr>
+            <w:tcW w:w="1980" w:type="dxa"/>
+            <w:tcBorders>
+              <w:top w:val="single" w:sz="4" w:space="0" w:color="auto"/>
+            </w:tcBorders>
+          </w:tcPr>
+          <w:p>
+            <w:pPr>
+              <w:rPr>
+                <w:b/>
+                <w:bCs/>
+              </w:rPr>
+            </w:pPr>
+            <w:r>
+              <w:rPr>
+                <w:b/>
+                <w:bCs/>
+              </w:rPr>
+              <w:t>NOMBRE</w:t>
+            </w:r>
+          </w:p>
+        </w:tc>
+        <w:tc>
+          <w:tcPr>
+            <w:tcW w:w="6848" w:type="dxa"/>
+          </w:tcPr>
+          <w:p>
+            <w:pPr>
+              <w:rPr>
+                <w:b/>
+                <w:bCs/>
+              </w:rPr>
+            </w:pPr>
+            <w:r>
+              <w:rPr>
+                <w:b/>
+                <w:bCs/>
+              </w:rPr>
+              <w:t>Actualizar evento</w:t>
+            </w:r>
+          </w:p>
+        </w:tc>
+      </w:tr>
+      <w:tr>
+        <w:tc>
+          <w:tcPr>
+            <w:tcW w:w="1980" w:type="dxa"/>
+          </w:tcPr>
+          <w:p>
+            <w:pPr>
+              <w:rPr>
+                <w:b/>
+                <w:bCs/>
+              </w:rPr>
+            </w:pPr>
+            <w:r>
+              <w:rPr>
+                <w:b/>
+                <w:bCs/>
+              </w:rPr>
+              <w:t xml:space="preserve">DESCRPCION </w:t>
+            </w:r>
+          </w:p>
+        </w:tc>
+        <w:tc>
+          <w:tcPr>
+            <w:tcW w:w="6848" w:type="dxa"/>
+          </w:tcPr>
+          <w:p/>
+        </w:tc>
+      </w:tr>
+      <w:tr>
+        <w:tc>
+          <w:tcPr>
+            <w:tcW w:w="1980" w:type="dxa"/>
+          </w:tcPr>
+          <w:p>
+            <w:pPr>
+              <w:rPr>
+                <w:b/>
+                <w:bCs/>
+              </w:rPr>
+            </w:pPr>
+            <w:r>
+              <w:rPr>
+                <w:b/>
+                <w:bCs/>
+              </w:rPr>
+              <w:t>CRITERIOS DE</w:t>
+            </w:r>
+          </w:p>
+          <w:p>
+            <w:pPr>
+              <w:rPr>
+                <w:b/>
+                <w:bCs/>
+              </w:rPr>
+            </w:pPr>
+            <w:r>
+              <w:rPr>
+                <w:b/>
+                <w:bCs/>
+              </w:rPr>
+              <w:t>EVALUACIÓN</w:t>
+            </w:r>
+          </w:p>
+        </w:tc>
+        <w:tc>
+          <w:tcPr>
+            <w:tcW w:w="6848" w:type="dxa"/>
+          </w:tcPr>
+          <w:p>
+            <w:pPr>
+              <w:pStyle w:val="Prrafodelista"/>
+              <w:numPr>
+                <w:ilvl w:val="0"/>
+                <w:numId w:val="26"/>
+              </w:numPr>
+            </w:pPr>
+            <w:r>
+              <w:rPr>
+                <w:rFonts w:ascii="Segoe UI" w:eastAsia="Times New Roman" w:hAnsi="Segoe UI" w:cs="Segoe UI"/>
+                <w:color w:val="0F1115"/>
+                <w:kern w:val="0"/>
+                <w:lang w:eastAsia="es-419"/>
+                <w14:ligatures w14:val="none"/>
+              </w:rPr>
+              <w:t xml:space="preserve">El </w:t>
+            </w:r>
+          </w:p>
+          <w:p>
+            <w:pPr>
+              <w:pStyle w:val="Prrafodelista"/>
+              <w:numPr>
+                <w:ilvl w:val="0"/>
+                <w:numId w:val="26"/>
+              </w:numPr>
+            </w:pPr>
+            <w:r>
+              <w:rPr>
+                <w:rFonts w:ascii="Segoe UI" w:eastAsia="Times New Roman" w:hAnsi="Segoe UI" w:cs="Segoe UI"/>
+                <w:color w:val="0F1115"/>
+                <w:kern w:val="0"/>
+                <w:lang w:eastAsia="es-419"/>
+                <w14:ligatures w14:val="none"/>
+              </w:rPr>
+              <w:t>El</w:t>
+            </w:r>
+            <w:r>
+              <w:rPr>
+                <w:rFonts w:ascii="Segoe UI" w:eastAsia="Times New Roman" w:hAnsi="Segoe UI" w:cs="Segoe UI"/>
+                <w:color w:val="0F1115"/>
+                <w:kern w:val="0"/>
+                <w:lang w:eastAsia="es-419"/>
+                <w14:ligatures w14:val="none"/>
+              </w:rPr>
+              <w:t>.</w:t>
+            </w:r>
+          </w:p>
+          <w:p>
+            <w:pPr>
+              <w:pStyle w:val="Prrafodelista"/>
+              <w:numPr>
+                <w:ilvl w:val="0"/>
+                <w:numId w:val="26"/>
+              </w:numPr>
+            </w:pPr>
+            <w:r>
+              <w:rPr>
+                <w:rFonts w:ascii="Segoe UI" w:eastAsia="Times New Roman" w:hAnsi="Segoe UI" w:cs="Segoe UI"/>
+                <w:color w:val="0F1115"/>
+                <w:kern w:val="0"/>
+                <w:lang w:eastAsia="es-419"/>
+                <w14:ligatures w14:val="none"/>
+              </w:rPr>
+              <w:t xml:space="preserve">Solo </w:t>
+            </w:r>
+          </w:p>
+          <w:p>
+            <w:pPr>
+              <w:pStyle w:val="Prrafodelista"/>
+            </w:pPr>
+          </w:p>
+        </w:tc>
+      </w:tr>
+      <w:tr>
+        <w:tc>
+          <w:tcPr>
+            <w:tcW w:w="1980" w:type="dxa"/>
+          </w:tcPr>
+          <w:p>
+            <w:pPr>
+              <w:rPr>
+                <w:b/>
+                <w:bCs/>
+              </w:rPr>
+            </w:pPr>
+            <w:r>
+              <w:rPr>
+                <w:b/>
+                <w:bCs/>
+              </w:rPr>
+              <w:t>PRIORIDAD</w:t>
+            </w:r>
+          </w:p>
+        </w:tc>
+        <w:tc>
+          <w:tcPr>
+            <w:tcW w:w="6848" w:type="dxa"/>
+          </w:tcPr>
+          <w:p>
+            <w:r>
+              <w:t>Alta</w:t>
+            </w:r>
+          </w:p>
+        </w:tc>
+      </w:tr>
+      <w:tr>
+        <w:tc>
+          <w:tcPr>
+            <w:tcW w:w="1980" w:type="dxa"/>
+          </w:tcPr>
+          <w:p>
+            <w:pPr>
+              <w:rPr>
+                <w:b/>
+                <w:bCs/>
+              </w:rPr>
+            </w:pPr>
+            <w:r>
+              <w:rPr>
+                <w:b/>
+                <w:bCs/>
+              </w:rPr>
+              <w:t>RF</w:t>
+            </w:r>
+          </w:p>
+        </w:tc>
+        <w:tc>
+          <w:tcPr>
+            <w:tcW w:w="6848" w:type="dxa"/>
+          </w:tcPr>
+          <w:p>
+            <w:r>
+              <w:t>017</w:t>
+            </w:r>
+          </w:p>
+        </w:tc>
+      </w:tr>
+      <w:tr>
+        <w:tc>
+          <w:tcPr>
+            <w:tcW w:w="1980" w:type="dxa"/>
+          </w:tcPr>
+          <w:p>
+            <w:pPr>
+              <w:rPr>
+                <w:b/>
+                <w:bCs/>
+              </w:rPr>
+            </w:pPr>
+            <w:r>
+              <w:rPr>
+                <w:b/>
+                <w:bCs/>
+              </w:rPr>
+              <w:t>RNF</w:t>
+            </w:r>
+          </w:p>
+        </w:tc>
+        <w:tc>
+          <w:tcPr>
+            <w:tcW w:w="6848" w:type="dxa"/>
+          </w:tcPr>
+          <w:p>
+            <w:r>
+              <w:t>017</w:t>
+            </w:r>
+          </w:p>
+        </w:tc>
+      </w:tr>
+    </w:tbl>
+    <w:p>
+      <w:pPr>
+        <w:rPr>
+          <w:b/>
+          <w:bCs/>
+        </w:rPr>
+      </w:pPr>
+    </w:p>
+    <w:tbl>
+      <w:tblPr>
+        <w:tblStyle w:val="Tablaconcuadrcula"/>
+        <w:tblW w:w="0" w:type="auto"/>
+        <w:tblLook w:val="04A0" w:firstRow="1" w:lastRow="0" w:firstColumn="1" w:lastColumn="0" w:noHBand="0" w:noVBand="1"/>
+      </w:tblPr>
+      <w:tblGrid>
+        <w:gridCol w:w="1980"/>
+        <w:gridCol w:w="6848"/>
+      </w:tblGrid>
+      <w:tr>
+        <w:tc>
+          <w:tcPr>
+            <w:tcW w:w="1980" w:type="dxa"/>
+            <w:tcBorders>
+              <w:top w:val="nil"/>
+              <w:left w:val="nil"/>
+              <w:bottom w:val="single" w:sz="4" w:space="0" w:color="auto"/>
+              <w:right w:val="single" w:sz="4" w:space="0" w:color="auto"/>
+            </w:tcBorders>
+          </w:tcPr>
+          <w:p>
+            <w:pPr>
+              <w:jc w:val="center"/>
+              <w:rPr>
+                <w:b/>
+                <w:bCs/>
+              </w:rPr>
+            </w:pPr>
+          </w:p>
+        </w:tc>
+        <w:tc>
+          <w:tcPr>
+            <w:tcW w:w="6848" w:type="dxa"/>
+            <w:tcBorders>
+              <w:left w:val="single" w:sz="4" w:space="0" w:color="auto"/>
+            </w:tcBorders>
+          </w:tcPr>
+          <w:p>
+            <w:pPr>
+              <w:jc w:val="center"/>
+              <w:rPr>
+                <w:b/>
+                <w:bCs/>
+              </w:rPr>
+            </w:pPr>
+            <w:r>
+              <w:rPr>
+                <w:b/>
+                <w:bCs/>
+              </w:rPr>
+              <w:t>HU 0</w:t>
+            </w:r>
+            <w:r>
+              <w:rPr>
+                <w:b/>
+                <w:bCs/>
+              </w:rPr>
+              <w:t>1</w:t>
+            </w:r>
+            <w:r>
+              <w:rPr>
+                <w:b/>
+                <w:bCs/>
+              </w:rPr>
+              <w:t>5</w:t>
+            </w:r>
+          </w:p>
+        </w:tc>
+      </w:tr>
+      <w:tr>
+        <w:tc>
+          <w:tcPr>
+            <w:tcW w:w="1980" w:type="dxa"/>
+            <w:tcBorders>
+              <w:top w:val="single" w:sz="4" w:space="0" w:color="auto"/>
+            </w:tcBorders>
+          </w:tcPr>
+          <w:p>
+            <w:pPr>
+              <w:rPr>
+                <w:b/>
+                <w:bCs/>
+              </w:rPr>
+            </w:pPr>
+            <w:r>
+              <w:rPr>
+                <w:b/>
+                <w:bCs/>
+              </w:rPr>
+              <w:t>NOMBRE</w:t>
+            </w:r>
+          </w:p>
+        </w:tc>
+        <w:tc>
+          <w:tcPr>
+            <w:tcW w:w="6848" w:type="dxa"/>
+          </w:tcPr>
+          <w:p>
+            <w:pPr>
+              <w:rPr>
+                <w:b/>
+                <w:bCs/>
+              </w:rPr>
+            </w:pPr>
+            <w:r>
+              <w:rPr>
+                <w:b/>
+                <w:bCs/>
+              </w:rPr>
+              <w:t>Eliminar evento</w:t>
+            </w:r>
+          </w:p>
+        </w:tc>
+      </w:tr>
+      <w:tr>
+        <w:tc>
+          <w:tcPr>
+            <w:tcW w:w="1980" w:type="dxa"/>
+          </w:tcPr>
+          <w:p>
+            <w:pPr>
+              <w:rPr>
+                <w:b/>
+                <w:bCs/>
+              </w:rPr>
+            </w:pPr>
+            <w:r>
+              <w:rPr>
+                <w:b/>
+                <w:bCs/>
+              </w:rPr>
+              <w:t xml:space="preserve">DESCRPCION </w:t>
+            </w:r>
+          </w:p>
+        </w:tc>
+        <w:tc>
+          <w:tcPr>
+            <w:tcW w:w="6848" w:type="dxa"/>
+          </w:tcPr>
+          <w:p/>
+        </w:tc>
+      </w:tr>
+      <w:tr>
+        <w:tc>
+          <w:tcPr>
+            <w:tcW w:w="1980" w:type="dxa"/>
+          </w:tcPr>
+          <w:p>
+            <w:pPr>
+              <w:rPr>
+                <w:b/>
+                <w:bCs/>
+              </w:rPr>
+            </w:pPr>
+            <w:r>
+              <w:rPr>
+                <w:b/>
+                <w:bCs/>
+              </w:rPr>
+              <w:t>CRITERIOS DE</w:t>
+            </w:r>
+          </w:p>
+          <w:p>
+            <w:pPr>
+              <w:rPr>
+                <w:b/>
+                <w:bCs/>
+              </w:rPr>
+            </w:pPr>
+            <w:r>
+              <w:rPr>
+                <w:b/>
+                <w:bCs/>
+              </w:rPr>
+              <w:t>EVALUACIÓN</w:t>
+            </w:r>
+          </w:p>
+        </w:tc>
+        <w:tc>
+          <w:tcPr>
+            <w:tcW w:w="6848" w:type="dxa"/>
+          </w:tcPr>
+          <w:p>
+            <w:pPr>
+              <w:pStyle w:val="Prrafodelista"/>
+              <w:numPr>
+                <w:ilvl w:val="0"/>
+                <w:numId w:val="27"/>
+              </w:numPr>
+            </w:pPr>
+            <w:r>
+              <w:rPr>
+                <w:rFonts w:ascii="Segoe UI" w:eastAsia="Times New Roman" w:hAnsi="Segoe UI" w:cs="Segoe UI"/>
+                <w:color w:val="0F1115"/>
+                <w:kern w:val="0"/>
+                <w:lang w:eastAsia="es-419"/>
+                <w14:ligatures w14:val="none"/>
+              </w:rPr>
+              <w:t xml:space="preserve">El </w:t>
+            </w:r>
+          </w:p>
+          <w:p>
+            <w:pPr>
+              <w:pStyle w:val="Prrafodelista"/>
+              <w:numPr>
+                <w:ilvl w:val="0"/>
+                <w:numId w:val="27"/>
+              </w:numPr>
+            </w:pPr>
+            <w:r>
+              <w:rPr>
+                <w:rFonts w:ascii="Segoe UI" w:eastAsia="Times New Roman" w:hAnsi="Segoe UI" w:cs="Segoe UI"/>
+                <w:color w:val="0F1115"/>
+                <w:kern w:val="0"/>
+                <w:lang w:eastAsia="es-419"/>
+                <w14:ligatures w14:val="none"/>
+              </w:rPr>
+              <w:t>El</w:t>
+            </w:r>
+            <w:r>
+              <w:rPr>
+                <w:rFonts w:ascii="Segoe UI" w:eastAsia="Times New Roman" w:hAnsi="Segoe UI" w:cs="Segoe UI"/>
+                <w:color w:val="0F1115"/>
+                <w:kern w:val="0"/>
+                <w:lang w:eastAsia="es-419"/>
+                <w14:ligatures w14:val="none"/>
+              </w:rPr>
+              <w:t>.</w:t>
+            </w:r>
+          </w:p>
+          <w:p>
+            <w:pPr>
+              <w:pStyle w:val="Prrafodelista"/>
+              <w:numPr>
+                <w:ilvl w:val="0"/>
+                <w:numId w:val="27"/>
+              </w:numPr>
+            </w:pPr>
+            <w:r>
+              <w:rPr>
+                <w:rFonts w:ascii="Segoe UI" w:eastAsia="Times New Roman" w:hAnsi="Segoe UI" w:cs="Segoe UI"/>
+                <w:color w:val="0F1115"/>
+                <w:kern w:val="0"/>
+                <w:lang w:eastAsia="es-419"/>
+                <w14:ligatures w14:val="none"/>
+              </w:rPr>
+              <w:t xml:space="preserve">Solo </w:t>
+            </w:r>
+          </w:p>
+          <w:p>
+            <w:pPr>
+              <w:pStyle w:val="Prrafodelista"/>
+            </w:pPr>
+          </w:p>
+        </w:tc>
+      </w:tr>
+      <w:tr>
+        <w:tc>
+          <w:tcPr>
+            <w:tcW w:w="1980" w:type="dxa"/>
+          </w:tcPr>
+          <w:p>
+            <w:pPr>
+              <w:rPr>
+                <w:b/>
+                <w:bCs/>
+              </w:rPr>
+            </w:pPr>
+            <w:r>
+              <w:rPr>
+                <w:b/>
+                <w:bCs/>
+              </w:rPr>
+              <w:t>PRIORIDAD</w:t>
+            </w:r>
+          </w:p>
+        </w:tc>
+        <w:tc>
+          <w:tcPr>
+            <w:tcW w:w="6848" w:type="dxa"/>
+          </w:tcPr>
+          <w:p>
+            <w:r>
+              <w:t>Alta</w:t>
+            </w:r>
+          </w:p>
+        </w:tc>
+      </w:tr>
+      <w:tr>
+        <w:tc>
+          <w:tcPr>
+            <w:tcW w:w="1980" w:type="dxa"/>
+          </w:tcPr>
+          <w:p>
+            <w:pPr>
+              <w:rPr>
+                <w:b/>
+                <w:bCs/>
+              </w:rPr>
+            </w:pPr>
+            <w:r>
+              <w:rPr>
+                <w:b/>
+                <w:bCs/>
+              </w:rPr>
+              <w:t>RF</w:t>
+            </w:r>
+          </w:p>
+        </w:tc>
+        <w:tc>
+          <w:tcPr>
+            <w:tcW w:w="6848" w:type="dxa"/>
+          </w:tcPr>
+          <w:p>
+            <w:r>
+              <w:t>017</w:t>
+            </w:r>
+          </w:p>
+        </w:tc>
+      </w:tr>
+      <w:tr>
+        <w:tc>
+          <w:tcPr>
+            <w:tcW w:w="1980" w:type="dxa"/>
+          </w:tcPr>
+          <w:p>
+            <w:pPr>
+              <w:rPr>
+                <w:b/>
+                <w:bCs/>
+              </w:rPr>
+            </w:pPr>
+            <w:r>
+              <w:rPr>
+                <w:b/>
+                <w:bCs/>
+              </w:rPr>
+              <w:t>RNF</w:t>
+            </w:r>
+          </w:p>
+        </w:tc>
+        <w:tc>
+          <w:tcPr>
+            <w:tcW w:w="6848" w:type="dxa"/>
+          </w:tcPr>
+          <w:p>
+            <w:r>
+              <w:t>017</w:t>
+            </w:r>
+          </w:p>
+        </w:tc>
+      </w:tr>
+    </w:tbl>
+    <w:p>
+      <w:pPr>
+        <w:rPr>
+          <w:b/>
+          <w:bCs/>
+        </w:rPr>
+      </w:pPr>
+    </w:p>
+    <w:tbl>
+      <w:tblPr>
+        <w:tblStyle w:val="Tablaconcuadrcula"/>
+        <w:tblW w:w="0" w:type="auto"/>
+        <w:tblLook w:val="04A0" w:firstRow="1" w:lastRow="0" w:firstColumn="1" w:lastColumn="0" w:noHBand="0" w:noVBand="1"/>
+      </w:tblPr>
+      <w:tblGrid>
+        <w:gridCol w:w="1980"/>
+        <w:gridCol w:w="6848"/>
+      </w:tblGrid>
+      <w:tr>
+        <w:tc>
+          <w:tcPr>
+            <w:tcW w:w="1980" w:type="dxa"/>
+            <w:tcBorders>
+              <w:top w:val="nil"/>
+              <w:left w:val="nil"/>
+              <w:bottom w:val="single" w:sz="4" w:space="0" w:color="auto"/>
+              <w:right w:val="single" w:sz="4" w:space="0" w:color="auto"/>
+            </w:tcBorders>
+          </w:tcPr>
+          <w:p>
+            <w:pPr>
+              <w:jc w:val="center"/>
+              <w:rPr>
+                <w:b/>
+                <w:bCs/>
+              </w:rPr>
+            </w:pPr>
+          </w:p>
+        </w:tc>
+        <w:tc>
+          <w:tcPr>
+            <w:tcW w:w="6848" w:type="dxa"/>
+            <w:tcBorders>
+              <w:left w:val="single" w:sz="4" w:space="0" w:color="auto"/>
+            </w:tcBorders>
+          </w:tcPr>
+          <w:p>
+            <w:pPr>
+              <w:jc w:val="center"/>
+              <w:rPr>
+                <w:b/>
+                <w:bCs/>
+              </w:rPr>
+            </w:pPr>
+            <w:r>
+              <w:rPr>
+                <w:b/>
+                <w:bCs/>
+              </w:rPr>
+              <w:t>HU 0</w:t>
+            </w:r>
+            <w:r>
+              <w:rPr>
+                <w:b/>
+                <w:bCs/>
+              </w:rPr>
+              <w:t>1</w:t>
+            </w:r>
+            <w:r>
+              <w:rPr>
+                <w:b/>
+                <w:bCs/>
+              </w:rPr>
+              <w:t>6</w:t>
+            </w:r>
+          </w:p>
+        </w:tc>
+      </w:tr>
+      <w:tr>
+        <w:tc>
+          <w:tcPr>
+            <w:tcW w:w="1980" w:type="dxa"/>
+            <w:tcBorders>
+              <w:top w:val="single" w:sz="4" w:space="0" w:color="auto"/>
+            </w:tcBorders>
+          </w:tcPr>
+          <w:p>
+            <w:pPr>
+              <w:rPr>
+                <w:b/>
+                <w:bCs/>
+              </w:rPr>
+            </w:pPr>
+            <w:r>
+              <w:rPr>
+                <w:b/>
+                <w:bCs/>
+              </w:rPr>
+              <w:t>NOMBRE</w:t>
+            </w:r>
+          </w:p>
+        </w:tc>
+        <w:tc>
+          <w:tcPr>
+            <w:tcW w:w="6848" w:type="dxa"/>
+          </w:tcPr>
+          <w:p>
+            <w:pPr>
+              <w:rPr>
+                <w:b/>
+                <w:bCs/>
+              </w:rPr>
+            </w:pPr>
+            <w:r>
+              <w:rPr>
+                <w:b/>
+                <w:bCs/>
+              </w:rPr>
+              <w:t xml:space="preserve">Consultar </w:t>
+            </w:r>
+            <w:r>
+              <w:rPr>
+                <w:b/>
+                <w:bCs/>
+              </w:rPr>
+              <w:t>un evento</w:t>
+            </w:r>
+          </w:p>
+        </w:tc>
+      </w:tr>
+      <w:tr>
+        <w:tc>
+          <w:tcPr>
+            <w:tcW w:w="1980" w:type="dxa"/>
+          </w:tcPr>
+          <w:p>
+            <w:pPr>
+              <w:rPr>
+                <w:b/>
+                <w:bCs/>
+              </w:rPr>
+            </w:pPr>
+            <w:r>
+              <w:rPr>
+                <w:b/>
+                <w:bCs/>
+              </w:rPr>
+              <w:t xml:space="preserve">DESCRPCION </w:t>
+            </w:r>
+          </w:p>
+        </w:tc>
+        <w:tc>
+          <w:tcPr>
+            <w:tcW w:w="6848" w:type="dxa"/>
+          </w:tcPr>
+          <w:p/>
+        </w:tc>
+      </w:tr>
+      <w:tr>
+        <w:tc>
+          <w:tcPr>
+            <w:tcW w:w="1980" w:type="dxa"/>
+          </w:tcPr>
+          <w:p>
+            <w:pPr>
+              <w:rPr>
+                <w:b/>
+                <w:bCs/>
+              </w:rPr>
+            </w:pPr>
+            <w:r>
+              <w:rPr>
+                <w:b/>
+                <w:bCs/>
+              </w:rPr>
+              <w:t>CRITERIOS DE</w:t>
+            </w:r>
+          </w:p>
+          <w:p>
+            <w:pPr>
+              <w:rPr>
+                <w:b/>
+                <w:bCs/>
+              </w:rPr>
+            </w:pPr>
+            <w:r>
+              <w:rPr>
+                <w:b/>
+                <w:bCs/>
+              </w:rPr>
+              <w:t>EVALUACIÓN</w:t>
+            </w:r>
+          </w:p>
+        </w:tc>
+        <w:tc>
+          <w:tcPr>
+            <w:tcW w:w="6848" w:type="dxa"/>
+          </w:tcPr>
+          <w:p>
+            <w:pPr>
+              <w:pStyle w:val="Prrafodelista"/>
+              <w:numPr>
+                <w:ilvl w:val="0"/>
+                <w:numId w:val="28"/>
+              </w:numPr>
+            </w:pPr>
+            <w:r>
+              <w:rPr>
+                <w:rFonts w:ascii="Segoe UI" w:eastAsia="Times New Roman" w:hAnsi="Segoe UI" w:cs="Segoe UI"/>
+                <w:color w:val="0F1115"/>
+                <w:kern w:val="0"/>
+                <w:lang w:eastAsia="es-419"/>
+                <w14:ligatures w14:val="none"/>
+              </w:rPr>
+              <w:t xml:space="preserve">El </w:t>
+            </w:r>
+          </w:p>
+          <w:p>
+            <w:pPr>
+              <w:pStyle w:val="Prrafodelista"/>
+              <w:numPr>
+                <w:ilvl w:val="0"/>
+                <w:numId w:val="28"/>
+              </w:numPr>
+            </w:pPr>
+            <w:r>
+              <w:rPr>
+                <w:rFonts w:ascii="Segoe UI" w:eastAsia="Times New Roman" w:hAnsi="Segoe UI" w:cs="Segoe UI"/>
+                <w:color w:val="0F1115"/>
+                <w:kern w:val="0"/>
+                <w:lang w:eastAsia="es-419"/>
+                <w14:ligatures w14:val="none"/>
+              </w:rPr>
+              <w:t>El</w:t>
+            </w:r>
+            <w:r>
+              <w:rPr>
+                <w:rFonts w:ascii="Segoe UI" w:eastAsia="Times New Roman" w:hAnsi="Segoe UI" w:cs="Segoe UI"/>
+                <w:color w:val="0F1115"/>
+                <w:kern w:val="0"/>
+                <w:lang w:eastAsia="es-419"/>
+                <w14:ligatures w14:val="none"/>
+              </w:rPr>
+              <w:t>.</w:t>
+            </w:r>
+          </w:p>
+          <w:p>
+            <w:pPr>
+              <w:pStyle w:val="Prrafodelista"/>
+              <w:numPr>
+                <w:ilvl w:val="0"/>
+                <w:numId w:val="28"/>
+              </w:numPr>
+            </w:pPr>
+            <w:r>
+              <w:rPr>
+                <w:rFonts w:ascii="Segoe UI" w:eastAsia="Times New Roman" w:hAnsi="Segoe UI" w:cs="Segoe UI"/>
+                <w:color w:val="0F1115"/>
+                <w:kern w:val="0"/>
+                <w:lang w:eastAsia="es-419"/>
+                <w14:ligatures w14:val="none"/>
+              </w:rPr>
+              <w:t xml:space="preserve">Solo </w:t>
+            </w:r>
+          </w:p>
+          <w:p>
+            <w:pPr>
+              <w:pStyle w:val="Prrafodelista"/>
+            </w:pPr>
+          </w:p>
+        </w:tc>
+      </w:tr>
+      <w:tr>
+        <w:tc>
+          <w:tcPr>
+            <w:tcW w:w="1980" w:type="dxa"/>
+          </w:tcPr>
+          <w:p>
+            <w:pPr>
+              <w:rPr>
+                <w:b/>
+                <w:bCs/>
+              </w:rPr>
+            </w:pPr>
+            <w:r>
+              <w:rPr>
+                <w:b/>
+                <w:bCs/>
+              </w:rPr>
+              <w:t>PRIORIDAD</w:t>
+            </w:r>
+          </w:p>
+        </w:tc>
+        <w:tc>
+          <w:tcPr>
+            <w:tcW w:w="6848" w:type="dxa"/>
+          </w:tcPr>
+          <w:p>
+            <w:r>
+              <w:t>Alta</w:t>
+            </w:r>
+          </w:p>
+        </w:tc>
+      </w:tr>
+      <w:tr>
+        <w:tc>
+          <w:tcPr>
+            <w:tcW w:w="1980" w:type="dxa"/>
+          </w:tcPr>
+          <w:p>
+            <w:pPr>
+              <w:rPr>
+                <w:b/>
+                <w:bCs/>
+              </w:rPr>
+            </w:pPr>
+            <w:r>
+              <w:rPr>
+                <w:b/>
+                <w:bCs/>
+              </w:rPr>
+              <w:t>RF</w:t>
+            </w:r>
+          </w:p>
+        </w:tc>
+        <w:tc>
+          <w:tcPr>
+            <w:tcW w:w="6848" w:type="dxa"/>
+          </w:tcPr>
+          <w:p>
+            <w:r>
+              <w:t>017</w:t>
+            </w:r>
+          </w:p>
+        </w:tc>
+      </w:tr>
+      <w:tr>
+        <w:tc>
+          <w:tcPr>
+            <w:tcW w:w="1980" w:type="dxa"/>
+          </w:tcPr>
+          <w:p>
+            <w:pPr>
+              <w:rPr>
+                <w:b/>
+                <w:bCs/>
+              </w:rPr>
+            </w:pPr>
+            <w:r>
+              <w:rPr>
+                <w:b/>
+                <w:bCs/>
+              </w:rPr>
+              <w:t>RNF</w:t>
+            </w:r>
+          </w:p>
+        </w:tc>
+        <w:tc>
+          <w:tcPr>
+            <w:tcW w:w="6848" w:type="dxa"/>
+          </w:tcPr>
+          <w:p>
+            <w:r>
+              <w:t>017</w:t>
+            </w:r>
+          </w:p>
+        </w:tc>
+      </w:tr>
+    </w:tbl>
+    <w:p>
+      <w:pPr>
+        <w:rPr>
+          <w:b/>
+          <w:bCs/>
+        </w:rPr>
+      </w:pPr>
+    </w:p>
+    <w:p>
+      <w:pPr>
+        <w:rPr>
+          <w:b/>
+          <w:bCs/>
+        </w:rPr>
+      </w:pPr>
+    </w:p>
+    <w:p>
+      <w:pPr>
+        <w:rPr>
+          <w:b/>
+          <w:bCs/>
+        </w:rPr>
+      </w:pPr>
+    </w:p>
+    <w:p>
+      <w:pPr>
+        <w:rPr>
+          <w:b/>
+          <w:bCs/>
+        </w:rPr>
+      </w:pPr>
+    </w:p>
+    <w:p>
+      <w:pPr>
+        <w:rPr>
+          <w:b/>
+          <w:bCs/>
+        </w:rPr>
+      </w:pPr>
+    </w:p>
+    <w:p>
+      <w:pPr>
+        <w:rPr>
+          <w:b/>
+          <w:bCs/>
+        </w:rPr>
+      </w:pPr>
+    </w:p>
     <w:p>
       <w:pPr>
         <w:tabs>
@@ -6841,38 +8368,7 @@
           <w:tcPr>
             <w:tcW w:w="6848" w:type="dxa"/>
           </w:tcPr>
-          <w:p>
-            <w:r>
-              <w:rPr>
-                <w:b/>
-                <w:bCs/>
-              </w:rPr>
-              <w:t xml:space="preserve">Como </w:t>
-            </w:r>
-            <w:r>
-              <w:t>administrador</w:t>
-            </w:r>
-            <w:r>
-              <w:rPr>
-                <w:b/>
-                <w:bCs/>
-              </w:rPr>
-              <w:t xml:space="preserve"> quiero </w:t>
-            </w:r>
-            <w:r>
-              <w:t>poder generar los reportes,</w:t>
-            </w:r>
-            <w:r>
-              <w:rPr>
-                <w:b/>
-                <w:bCs/>
-              </w:rPr>
-              <w:t xml:space="preserve"> para </w:t>
-            </w:r>
-            <w:r>
-              <w:t>conocer el estado de la empresa y tomar decisiones con base en información real, para que así sea más fácil y rápido poder ver los registros de los usuarios y nos verlos uno por uno.</w:t>
-            </w:r>
-          </w:p>
+          <w:p/>
         </w:tc>
       </w:tr>
       <w:tr>
@@ -6920,7 +8416,7 @@
               <w:pStyle w:val="Prrafodelista"/>
               <w:numPr>
                 <w:ilvl w:val="0"/>
-                <w:numId w:val="26"/>
+                <w:numId w:val="27"/>
               </w:numPr>
             </w:pPr>
             <w:r>
@@ -6931,7 +8427,7 @@
                 <w:lang w:eastAsia="es-419"/>
                 <w14:ligatures w14:val="none"/>
               </w:rPr>
-              <w:t>El administrador puede visualizar el reporte antes de descargarlo.</w:t>
+              <w:t xml:space="preserve">El </w:t>
             </w:r>
           </w:p>
           <w:p>
@@ -6939,7 +8435,7 @@
               <w:pStyle w:val="Prrafodelista"/>
               <w:numPr>
                 <w:ilvl w:val="0"/>
-                <w:numId w:val="26"/>
+                <w:numId w:val="27"/>
               </w:numPr>
             </w:pPr>
             <w:r>
@@ -6950,7 +8446,7 @@
                 <w:lang w:eastAsia="es-419"/>
                 <w14:ligatures w14:val="none"/>
               </w:rPr>
-              <w:t>El sistema permite exportar el reporte en formato PDF</w:t>
+              <w:t>El</w:t>
             </w:r>
             <w:r>
               <w:rPr>
@@ -6968,7 +8464,7 @@
               <w:pStyle w:val="Prrafodelista"/>
               <w:numPr>
                 <w:ilvl w:val="0"/>
-                <w:numId w:val="26"/>
+                <w:numId w:val="27"/>
               </w:numPr>
             </w:pPr>
             <w:r>
@@ -6979,59 +8475,13 @@
                 <w:lang w:eastAsia="es-419"/>
                 <w14:ligatures w14:val="none"/>
               </w:rPr>
-              <w:t xml:space="preserve">Solo los usuarios con rol de </w:t>
-            </w:r>
-            <w:r>
-              <w:rPr>
-                <w:rFonts w:ascii="Segoe UI" w:eastAsia="Times New Roman" w:hAnsi="Segoe UI" w:cs="Segoe UI"/>
-                <w:b/>
-                <w:bCs/>
-                <w:color w:val="0F1115"/>
-                <w:kern w:val="0"/>
-                <w:lang w:eastAsia="es-419"/>
-                <w14:ligatures w14:val="none"/>
-              </w:rPr>
-              <w:t>Administrador</w:t>
-            </w:r>
-            <w:r>
-              <w:rPr>
-                <w:rFonts w:ascii="Segoe UI" w:eastAsia="Times New Roman" w:hAnsi="Segoe UI" w:cs="Segoe UI"/>
-                <w:color w:val="0F1115"/>
-                <w:kern w:val="0"/>
-                <w:lang w:eastAsia="es-419"/>
-                <w14:ligatures w14:val="none"/>
-              </w:rPr>
-              <w:t xml:space="preserve"> pueden visualizar reportes</w:t>
-            </w:r>
-            <w:r>
-              <w:rPr>
-                <w:rFonts w:ascii="Segoe UI" w:eastAsia="Times New Roman" w:hAnsi="Segoe UI" w:cs="Segoe UI"/>
-                <w:color w:val="0F1115"/>
-                <w:kern w:val="0"/>
-                <w:lang w:eastAsia="es-419"/>
-                <w14:ligatures w14:val="none"/>
-              </w:rPr>
-              <w:t>.</w:t>
+              <w:t xml:space="preserve">Solo </w:t>
             </w:r>
           </w:p>
           <w:p>
             <w:pPr>
               <w:pStyle w:val="Prrafodelista"/>
-              <w:numPr>
-                <w:ilvl w:val="0"/>
-                <w:numId w:val="26"/>
-              </w:numPr>
-            </w:pPr>
-            <w:r>
-              <w:rPr>
-                <w:rFonts w:ascii="Segoe UI" w:eastAsia="Times New Roman" w:hAnsi="Segoe UI" w:cs="Segoe UI"/>
-                <w:color w:val="0F1115"/>
-                <w:kern w:val="0"/>
-                <w:lang w:eastAsia="es-419"/>
-                <w14:ligatures w14:val="none"/>
-              </w:rPr>
-              <w:t>El reporte presenta información completa, organizada y sin registros duplicados.</w:t>
-            </w:r>
+            </w:pPr>
           </w:p>
         </w:tc>
       </w:tr>
@@ -7492,7 +8942,7 @@
               <w:pStyle w:val="Prrafodelista"/>
               <w:numPr>
                 <w:ilvl w:val="0"/>
-                <w:numId w:val="26"/>
+                <w:numId w:val="27"/>
               </w:numPr>
             </w:pPr>
             <w:r>
@@ -7511,7 +8961,7 @@
               <w:pStyle w:val="Prrafodelista"/>
               <w:numPr>
                 <w:ilvl w:val="0"/>
-                <w:numId w:val="26"/>
+                <w:numId w:val="27"/>
               </w:numPr>
             </w:pPr>
             <w:r>
@@ -7540,7 +8990,7 @@
               <w:pStyle w:val="Prrafodelista"/>
               <w:numPr>
                 <w:ilvl w:val="0"/>
-                <w:numId w:val="26"/>
+                <w:numId w:val="27"/>
               </w:numPr>
             </w:pPr>
             <w:r>
@@ -7591,7 +9041,7 @@
               <w:pStyle w:val="Prrafodelista"/>
               <w:numPr>
                 <w:ilvl w:val="0"/>
-                <w:numId w:val="26"/>
+                <w:numId w:val="27"/>
               </w:numPr>
             </w:pPr>
             <w:r>
@@ -7940,7 +9390,6 @@
                 <w:b/>
                 <w:bCs/>
               </w:rPr>
-              <w:lastRenderedPageBreak/>
               <w:t xml:space="preserve">DESCRPCION </w:t>
             </w:r>
           </w:p>
@@ -8173,6 +9622,15 @@
         </w:tc>
       </w:tr>
     </w:tbl>
+    <w:p/>
+    <w:p/>
+    <w:p/>
+    <w:p/>
+    <w:p/>
+    <w:p/>
+    <w:p/>
+    <w:p/>
+    <w:p/>
     <w:p/>
     <w:tbl>
       <w:tblPr>
@@ -8629,7 +10087,6 @@
                 <w:b/>
                 <w:bCs/>
               </w:rPr>
-              <w:lastRenderedPageBreak/>
               <w:t xml:space="preserve">DESCRPCION </w:t>
             </w:r>
           </w:p>
@@ -9107,7 +10564,6 @@
               </w:numPr>
             </w:pPr>
             <w:r>
-              <w:lastRenderedPageBreak/>
               <w:t xml:space="preserve"> El usuario debe poder seleccionar el método de pago de su preferencia.</w:t>
             </w:r>
           </w:p>
@@ -9190,7 +10646,6 @@
                 <w:b/>
                 <w:bCs/>
               </w:rPr>
-              <w:lastRenderedPageBreak/>
               <w:t>PRIORIDAD</w:t>
             </w:r>
           </w:p>
@@ -10312,6 +11767,95 @@
     </w:lvl>
   </w:abstractNum>
   <w:abstractNum w:abstractNumId="11" w15:restartNumberingAfterBreak="0">
+    <w:nsid w:val="27A806CB"/>
+    <w:multiLevelType w:val="hybridMultilevel"/>
+    <w:tmpl w:val="5F129616"/>
+    <w:lvl w:ilvl="0" w:tplc="FFFFFFFF">
+      <w:start w:val="1"/>
+      <w:numFmt w:val="decimal"/>
+      <w:lvlText w:val="%1."/>
+      <w:lvlJc w:val="left"/>
+      <w:pPr>
+        <w:ind w:left="720" w:hanging="360"/>
+      </w:pPr>
+      <w:rPr>
+        <w:rFonts w:hint="default"/>
+      </w:rPr>
+    </w:lvl>
+    <w:lvl w:ilvl="1" w:tplc="FFFFFFFF" w:tentative="1">
+      <w:start w:val="1"/>
+      <w:numFmt w:val="lowerLetter"/>
+      <w:lvlText w:val="%2."/>
+      <w:lvlJc w:val="left"/>
+      <w:pPr>
+        <w:ind w:left="1440" w:hanging="360"/>
+      </w:pPr>
+    </w:lvl>
+    <w:lvl w:ilvl="2" w:tplc="FFFFFFFF" w:tentative="1">
+      <w:start w:val="1"/>
+      <w:numFmt w:val="lowerRoman"/>
+      <w:lvlText w:val="%3."/>
+      <w:lvlJc w:val="right"/>
+      <w:pPr>
+        <w:ind w:left="2160" w:hanging="180"/>
+      </w:pPr>
+    </w:lvl>
+    <w:lvl w:ilvl="3" w:tplc="FFFFFFFF" w:tentative="1">
+      <w:start w:val="1"/>
+      <w:numFmt w:val="decimal"/>
+      <w:lvlText w:val="%4."/>
+      <w:lvlJc w:val="left"/>
+      <w:pPr>
+        <w:ind w:left="2880" w:hanging="360"/>
+      </w:pPr>
+    </w:lvl>
+    <w:lvl w:ilvl="4" w:tplc="FFFFFFFF" w:tentative="1">
+      <w:start w:val="1"/>
+      <w:numFmt w:val="lowerLetter"/>
+      <w:lvlText w:val="%5."/>
+      <w:lvlJc w:val="left"/>
+      <w:pPr>
+        <w:ind w:left="3600" w:hanging="360"/>
+      </w:pPr>
+    </w:lvl>
+    <w:lvl w:ilvl="5" w:tplc="FFFFFFFF" w:tentative="1">
+      <w:start w:val="1"/>
+      <w:numFmt w:val="lowerRoman"/>
+      <w:lvlText w:val="%6."/>
+      <w:lvlJc w:val="right"/>
+      <w:pPr>
+        <w:ind w:left="4320" w:hanging="180"/>
+      </w:pPr>
+    </w:lvl>
+    <w:lvl w:ilvl="6" w:tplc="FFFFFFFF" w:tentative="1">
+      <w:start w:val="1"/>
+      <w:numFmt w:val="decimal"/>
+      <w:lvlText w:val="%7."/>
+      <w:lvlJc w:val="left"/>
+      <w:pPr>
+        <w:ind w:left="5040" w:hanging="360"/>
+      </w:pPr>
+    </w:lvl>
+    <w:lvl w:ilvl="7" w:tplc="FFFFFFFF" w:tentative="1">
+      <w:start w:val="1"/>
+      <w:numFmt w:val="lowerLetter"/>
+      <w:lvlText w:val="%8."/>
+      <w:lvlJc w:val="left"/>
+      <w:pPr>
+        <w:ind w:left="5760" w:hanging="360"/>
+      </w:pPr>
+    </w:lvl>
+    <w:lvl w:ilvl="8" w:tplc="FFFFFFFF" w:tentative="1">
+      <w:start w:val="1"/>
+      <w:numFmt w:val="lowerRoman"/>
+      <w:lvlText w:val="%9."/>
+      <w:lvlJc w:val="right"/>
+      <w:pPr>
+        <w:ind w:left="6480" w:hanging="180"/>
+      </w:pPr>
+    </w:lvl>
+  </w:abstractNum>
+  <w:abstractNum w:abstractNumId="12" w15:restartNumberingAfterBreak="0">
     <w:nsid w:val="28A61FED"/>
     <w:multiLevelType w:val="hybridMultilevel"/>
     <w:tmpl w:val="5F129616"/>
@@ -10400,7 +11944,7 @@
       </w:pPr>
     </w:lvl>
   </w:abstractNum>
-  <w:abstractNum w:abstractNumId="12" w15:restartNumberingAfterBreak="0">
+  <w:abstractNum w:abstractNumId="13" w15:restartNumberingAfterBreak="0">
     <w:nsid w:val="30F27ACC"/>
     <w:multiLevelType w:val="hybridMultilevel"/>
     <w:tmpl w:val="5F129616"/>
@@ -10489,7 +12033,7 @@
       </w:pPr>
     </w:lvl>
   </w:abstractNum>
-  <w:abstractNum w:abstractNumId="13" w15:restartNumberingAfterBreak="0">
+  <w:abstractNum w:abstractNumId="14" w15:restartNumberingAfterBreak="0">
     <w:nsid w:val="355002C3"/>
     <w:multiLevelType w:val="hybridMultilevel"/>
     <w:tmpl w:val="B2F0238E"/>
@@ -10578,7 +12122,7 @@
       </w:pPr>
     </w:lvl>
   </w:abstractNum>
-  <w:abstractNum w:abstractNumId="14" w15:restartNumberingAfterBreak="0">
+  <w:abstractNum w:abstractNumId="15" w15:restartNumberingAfterBreak="0">
     <w:nsid w:val="484D64B4"/>
     <w:multiLevelType w:val="hybridMultilevel"/>
     <w:tmpl w:val="5F129616"/>
@@ -10667,7 +12211,7 @@
       </w:pPr>
     </w:lvl>
   </w:abstractNum>
-  <w:abstractNum w:abstractNumId="15" w15:restartNumberingAfterBreak="0">
+  <w:abstractNum w:abstractNumId="16" w15:restartNumberingAfterBreak="0">
     <w:nsid w:val="486C1830"/>
     <w:multiLevelType w:val="multilevel"/>
     <w:tmpl w:val="2BFE1E58"/>
@@ -10780,7 +12324,7 @@
       </w:pPr>
     </w:lvl>
   </w:abstractNum>
-  <w:abstractNum w:abstractNumId="16" w15:restartNumberingAfterBreak="0">
+  <w:abstractNum w:abstractNumId="17" w15:restartNumberingAfterBreak="0">
     <w:nsid w:val="4B4C6910"/>
     <w:multiLevelType w:val="hybridMultilevel"/>
     <w:tmpl w:val="5F129616"/>
@@ -10869,7 +12413,7 @@
       </w:pPr>
     </w:lvl>
   </w:abstractNum>
-  <w:abstractNum w:abstractNumId="17" w15:restartNumberingAfterBreak="0">
+  <w:abstractNum w:abstractNumId="18" w15:restartNumberingAfterBreak="0">
     <w:nsid w:val="4B664BB0"/>
     <w:multiLevelType w:val="multilevel"/>
     <w:tmpl w:val="A36A8D64"/>
@@ -10982,7 +12526,7 @@
       </w:pPr>
     </w:lvl>
   </w:abstractNum>
-  <w:abstractNum w:abstractNumId="18" w15:restartNumberingAfterBreak="0">
+  <w:abstractNum w:abstractNumId="19" w15:restartNumberingAfterBreak="0">
     <w:nsid w:val="4FC73F10"/>
     <w:multiLevelType w:val="hybridMultilevel"/>
     <w:tmpl w:val="BF525814"/>
@@ -11071,7 +12615,7 @@
       </w:pPr>
     </w:lvl>
   </w:abstractNum>
-  <w:abstractNum w:abstractNumId="19" w15:restartNumberingAfterBreak="0">
+  <w:abstractNum w:abstractNumId="20" w15:restartNumberingAfterBreak="0">
     <w:nsid w:val="515604CA"/>
     <w:multiLevelType w:val="hybridMultilevel"/>
     <w:tmpl w:val="5F129616"/>
@@ -11160,7 +12704,7 @@
       </w:pPr>
     </w:lvl>
   </w:abstractNum>
-  <w:abstractNum w:abstractNumId="20" w15:restartNumberingAfterBreak="0">
+  <w:abstractNum w:abstractNumId="21" w15:restartNumberingAfterBreak="0">
     <w:nsid w:val="55A1445F"/>
     <w:multiLevelType w:val="hybridMultilevel"/>
     <w:tmpl w:val="5F129616"/>
@@ -11249,7 +12793,96 @@
       </w:pPr>
     </w:lvl>
   </w:abstractNum>
-  <w:abstractNum w:abstractNumId="21" w15:restartNumberingAfterBreak="0">
+  <w:abstractNum w:abstractNumId="22" w15:restartNumberingAfterBreak="0">
+    <w:nsid w:val="5A9312C8"/>
+    <w:multiLevelType w:val="hybridMultilevel"/>
+    <w:tmpl w:val="5F129616"/>
+    <w:lvl w:ilvl="0" w:tplc="FFFFFFFF">
+      <w:start w:val="1"/>
+      <w:numFmt w:val="decimal"/>
+      <w:lvlText w:val="%1."/>
+      <w:lvlJc w:val="left"/>
+      <w:pPr>
+        <w:ind w:left="720" w:hanging="360"/>
+      </w:pPr>
+      <w:rPr>
+        <w:rFonts w:hint="default"/>
+      </w:rPr>
+    </w:lvl>
+    <w:lvl w:ilvl="1" w:tplc="FFFFFFFF" w:tentative="1">
+      <w:start w:val="1"/>
+      <w:numFmt w:val="lowerLetter"/>
+      <w:lvlText w:val="%2."/>
+      <w:lvlJc w:val="left"/>
+      <w:pPr>
+        <w:ind w:left="1440" w:hanging="360"/>
+      </w:pPr>
+    </w:lvl>
+    <w:lvl w:ilvl="2" w:tplc="FFFFFFFF" w:tentative="1">
+      <w:start w:val="1"/>
+      <w:numFmt w:val="lowerRoman"/>
+      <w:lvlText w:val="%3."/>
+      <w:lvlJc w:val="right"/>
+      <w:pPr>
+        <w:ind w:left="2160" w:hanging="180"/>
+      </w:pPr>
+    </w:lvl>
+    <w:lvl w:ilvl="3" w:tplc="FFFFFFFF" w:tentative="1">
+      <w:start w:val="1"/>
+      <w:numFmt w:val="decimal"/>
+      <w:lvlText w:val="%4."/>
+      <w:lvlJc w:val="left"/>
+      <w:pPr>
+        <w:ind w:left="2880" w:hanging="360"/>
+      </w:pPr>
+    </w:lvl>
+    <w:lvl w:ilvl="4" w:tplc="FFFFFFFF" w:tentative="1">
+      <w:start w:val="1"/>
+      <w:numFmt w:val="lowerLetter"/>
+      <w:lvlText w:val="%5."/>
+      <w:lvlJc w:val="left"/>
+      <w:pPr>
+        <w:ind w:left="3600" w:hanging="360"/>
+      </w:pPr>
+    </w:lvl>
+    <w:lvl w:ilvl="5" w:tplc="FFFFFFFF" w:tentative="1">
+      <w:start w:val="1"/>
+      <w:numFmt w:val="lowerRoman"/>
+      <w:lvlText w:val="%6."/>
+      <w:lvlJc w:val="right"/>
+      <w:pPr>
+        <w:ind w:left="4320" w:hanging="180"/>
+      </w:pPr>
+    </w:lvl>
+    <w:lvl w:ilvl="6" w:tplc="FFFFFFFF" w:tentative="1">
+      <w:start w:val="1"/>
+      <w:numFmt w:val="decimal"/>
+      <w:lvlText w:val="%7."/>
+      <w:lvlJc w:val="left"/>
+      <w:pPr>
+        <w:ind w:left="5040" w:hanging="360"/>
+      </w:pPr>
+    </w:lvl>
+    <w:lvl w:ilvl="7" w:tplc="FFFFFFFF" w:tentative="1">
+      <w:start w:val="1"/>
+      <w:numFmt w:val="lowerLetter"/>
+      <w:lvlText w:val="%8."/>
+      <w:lvlJc w:val="left"/>
+      <w:pPr>
+        <w:ind w:left="5760" w:hanging="360"/>
+      </w:pPr>
+    </w:lvl>
+    <w:lvl w:ilvl="8" w:tplc="FFFFFFFF" w:tentative="1">
+      <w:start w:val="1"/>
+      <w:numFmt w:val="lowerRoman"/>
+      <w:lvlText w:val="%9."/>
+      <w:lvlJc w:val="right"/>
+      <w:pPr>
+        <w:ind w:left="6480" w:hanging="180"/>
+      </w:pPr>
+    </w:lvl>
+  </w:abstractNum>
+  <w:abstractNum w:abstractNumId="23" w15:restartNumberingAfterBreak="0">
     <w:nsid w:val="5C9B63E0"/>
     <w:multiLevelType w:val="multilevel"/>
     <w:tmpl w:val="B47465EE"/>
@@ -11362,7 +12995,7 @@
       </w:pPr>
     </w:lvl>
   </w:abstractNum>
-  <w:abstractNum w:abstractNumId="22" w15:restartNumberingAfterBreak="0">
+  <w:abstractNum w:abstractNumId="24" w15:restartNumberingAfterBreak="0">
     <w:nsid w:val="6DAE6C45"/>
     <w:multiLevelType w:val="multilevel"/>
     <w:tmpl w:val="A850709E"/>
@@ -11475,7 +13108,7 @@
       </w:pPr>
     </w:lvl>
   </w:abstractNum>
-  <w:abstractNum w:abstractNumId="23" w15:restartNumberingAfterBreak="0">
+  <w:abstractNum w:abstractNumId="25" w15:restartNumberingAfterBreak="0">
     <w:nsid w:val="70165CE0"/>
     <w:multiLevelType w:val="hybridMultilevel"/>
     <w:tmpl w:val="5F129616"/>
@@ -11564,7 +13197,7 @@
       </w:pPr>
     </w:lvl>
   </w:abstractNum>
-  <w:abstractNum w:abstractNumId="24" w15:restartNumberingAfterBreak="0">
+  <w:abstractNum w:abstractNumId="26" w15:restartNumberingAfterBreak="0">
     <w:nsid w:val="72A448A7"/>
     <w:multiLevelType w:val="hybridMultilevel"/>
     <w:tmpl w:val="5F129616"/>
@@ -11653,7 +13286,7 @@
       </w:pPr>
     </w:lvl>
   </w:abstractNum>
-  <w:abstractNum w:abstractNumId="25" w15:restartNumberingAfterBreak="0">
+  <w:abstractNum w:abstractNumId="27" w15:restartNumberingAfterBreak="0">
     <w:nsid w:val="7C7F5BA6"/>
     <w:multiLevelType w:val="hybridMultilevel"/>
     <w:tmpl w:val="B2F0238E"/>
@@ -11749,19 +13382,19 @@
     <w:abstractNumId w:val="5"/>
   </w:num>
   <w:num w:numId="3" w16cid:durableId="749037571">
-    <w:abstractNumId w:val="18"/>
+    <w:abstractNumId w:val="19"/>
   </w:num>
   <w:num w:numId="4" w16cid:durableId="1980988269">
-    <w:abstractNumId w:val="25"/>
+    <w:abstractNumId w:val="27"/>
   </w:num>
   <w:num w:numId="5" w16cid:durableId="1019741722">
     <w:abstractNumId w:val="7"/>
   </w:num>
   <w:num w:numId="6" w16cid:durableId="885750557">
-    <w:abstractNumId w:val="13"/>
+    <w:abstractNumId w:val="14"/>
   </w:num>
   <w:num w:numId="7" w16cid:durableId="1937977213">
-    <w:abstractNumId w:val="19"/>
+    <w:abstractNumId w:val="20"/>
   </w:num>
   <w:num w:numId="8" w16cid:durableId="1429695948">
     <w:abstractNumId w:val="0"/>
@@ -11770,25 +13403,25 @@
     <w:abstractNumId w:val="10"/>
   </w:num>
   <w:num w:numId="10" w16cid:durableId="2107145734">
-    <w:abstractNumId w:val="11"/>
+    <w:abstractNumId w:val="12"/>
   </w:num>
   <w:num w:numId="11" w16cid:durableId="1569800980">
-    <w:abstractNumId w:val="16"/>
+    <w:abstractNumId w:val="17"/>
   </w:num>
   <w:num w:numId="12" w16cid:durableId="1370573342">
-    <w:abstractNumId w:val="17"/>
+    <w:abstractNumId w:val="18"/>
   </w:num>
   <w:num w:numId="13" w16cid:durableId="1540898021">
-    <w:abstractNumId w:val="21"/>
+    <w:abstractNumId w:val="23"/>
   </w:num>
   <w:num w:numId="14" w16cid:durableId="1511800302">
     <w:abstractNumId w:val="8"/>
   </w:num>
   <w:num w:numId="15" w16cid:durableId="1667325052">
-    <w:abstractNumId w:val="22"/>
+    <w:abstractNumId w:val="24"/>
   </w:num>
   <w:num w:numId="16" w16cid:durableId="828136808">
-    <w:abstractNumId w:val="15"/>
+    <w:abstractNumId w:val="16"/>
   </w:num>
   <w:num w:numId="17" w16cid:durableId="1840654078">
     <w:abstractNumId w:val="9"/>
@@ -11803,22 +13436,28 @@
     <w:abstractNumId w:val="1"/>
   </w:num>
   <w:num w:numId="21" w16cid:durableId="1392001880">
-    <w:abstractNumId w:val="23"/>
+    <w:abstractNumId w:val="25"/>
   </w:num>
   <w:num w:numId="22" w16cid:durableId="617639395">
-    <w:abstractNumId w:val="20"/>
+    <w:abstractNumId w:val="21"/>
   </w:num>
   <w:num w:numId="23" w16cid:durableId="2052800904">
-    <w:abstractNumId w:val="24"/>
+    <w:abstractNumId w:val="26"/>
   </w:num>
   <w:num w:numId="24" w16cid:durableId="892811572">
     <w:abstractNumId w:val="4"/>
   </w:num>
   <w:num w:numId="25" w16cid:durableId="1171532834">
-    <w:abstractNumId w:val="12"/>
+    <w:abstractNumId w:val="13"/>
   </w:num>
   <w:num w:numId="26" w16cid:durableId="550654889">
-    <w:abstractNumId w:val="14"/>
+    <w:abstractNumId w:val="15"/>
+  </w:num>
+  <w:num w:numId="27" w16cid:durableId="1395737837">
+    <w:abstractNumId w:val="11"/>
+  </w:num>
+  <w:num w:numId="28" w16cid:durableId="798184755">
+    <w:abstractNumId w:val="22"/>
   </w:num>
 </w:numbering>
 </file>

</xml_diff>